<commit_message>
Perubahan rules di bahasa indonesia dan inggris yang tidak singkron
</commit_message>
<xml_diff>
--- a/DOKUMENTASI_MCP_CHATBOT.docx
+++ b/DOKUMENTASI_MCP_CHATBOT.docx
@@ -21,21 +21,12 @@
       <w:pPr>
         <w:jc w:val="center"/>
       </w:pPr>
-      <w:proofErr w:type="spellStart"/>
       <w:r>
         <w:rPr>
           <w:color w:val="4F81BD"/>
           <w:sz w:val="48"/>
         </w:rPr>
-        <w:t>Darkotech</w:t>
-      </w:r>
-      <w:proofErr w:type="spellEnd"/>
-      <w:r>
-        <w:rPr>
-          <w:color w:val="4F81BD"/>
-          <w:sz w:val="48"/>
-        </w:rPr>
-        <w:t xml:space="preserve"> AI</w:t>
+        <w:t>Darkotech AI</w:t>
       </w:r>
     </w:p>
     <w:p/>
@@ -72,13 +63,8 @@
             <w:tcW w:w="5669" w:type="dxa"/>
           </w:tcPr>
           <w:p>
-            <w:proofErr w:type="spellStart"/>
-            <w:r>
-              <w:t>Darkotech</w:t>
-            </w:r>
-            <w:proofErr w:type="spellEnd"/>
-            <w:r>
-              <w:t xml:space="preserve"> AI</w:t>
+            <w:r>
+              <w:t>Darkotech AI</w:t>
             </w:r>
           </w:p>
         </w:tc>
@@ -642,32 +628,11 @@
       </w:r>
     </w:p>
     <w:p>
-      <w:proofErr w:type="spellStart"/>
-      <w:r>
-        <w:t>Dakotech</w:t>
-      </w:r>
-      <w:proofErr w:type="spellEnd"/>
-      <w:r>
-        <w:t xml:space="preserve"> AI</w:t>
-      </w:r>
-      <w:r>
-        <w:t xml:space="preserve"> </w:t>
-      </w:r>
-      <w:proofErr w:type="spellStart"/>
-      <w:r>
-        <w:t>adalah</w:t>
-      </w:r>
-      <w:proofErr w:type="spellEnd"/>
-      <w:r>
-        <w:t xml:space="preserve"> </w:t>
-      </w:r>
-      <w:proofErr w:type="spellStart"/>
-      <w:r>
-        <w:t>aplikasi</w:t>
-      </w:r>
-      <w:proofErr w:type="spellEnd"/>
-      <w:r>
-        <w:t xml:space="preserve"> web berbasis Laravel 12.x yang mengintegrasikan chatbot cerdas dengan database PostgreSQL dan dokumentasi ERP. Aplikasi ini dirancang untuk membantu analisis data bisnis dan memberikan panduan operasional ERP secara interaktif menggunakan kecerdasan buatan (Artificial Intelligence).</w:t>
+      <w:r>
+        <w:t>Dakotech AI</w:t>
+      </w:r>
+      <w:r>
+        <w:t xml:space="preserve"> adalah aplikasi web berbasis Laravel 12.x yang mengintegrasikan chatbot cerdas dengan database PostgreSQL dan dokumentasi ERP. Aplikasi ini dirancang untuk membantu analisis data bisnis dan memberikan panduan operasional ERP secara interaktif menggunakan kecerdasan buatan (Artificial Intelligence).</w:t>
       </w:r>
     </w:p>
     <w:p>
@@ -9298,7 +9263,7 @@
               <w:rPr>
                 <w:sz w:val="20"/>
               </w:rPr>
-              <w:t>transaksi, pembeli</w:t>
+              <w:t>Tertentu</w:t>
             </w:r>
           </w:p>
         </w:tc>
@@ -9359,7 +9324,7 @@
               <w:rPr>
                 <w:sz w:val="20"/>
               </w:rPr>
-              <w:t>transaksi, produk</w:t>
+              <w:t>Tertentu</w:t>
             </w:r>
           </w:p>
         </w:tc>
@@ -9577,7 +9542,7 @@
               <w:rPr>
                 <w:sz w:val="20"/>
               </w:rPr>
-              <w:t>transaksi, pembeli</w:t>
+              <w:t>Tertentu</w:t>
             </w:r>
           </w:p>
         </w:tc>
@@ -9638,7 +9603,7 @@
               <w:rPr>
                 <w:sz w:val="20"/>
               </w:rPr>
-              <w:t>transaksi, produk</w:t>
+              <w:t>Tertentu</w:t>
             </w:r>
           </w:p>
         </w:tc>

</xml_diff>